<commit_message>
docs: update J&T UAT test cases and API integration documentation
</commit_message>
<xml_diff>
--- a/J&T_API_Testcase_V3.0 x PTRDI.docx
+++ b/J&T_API_Testcase_V3.0 x PTRDI.docx
@@ -2999,7 +2999,7 @@
               </w:rPr>
               <w:t>Yes</w:t>
               <w:br/>
-              <w:t>[PASS*]</w:t>
+              <w:t>[PASS]</w:t>
             </w:r>
           </w:p>
         </w:tc>
@@ -3523,12 +3523,12 @@
               <w:rPr>
                 <w:rFonts w:ascii="Arial" w:hAnsi="Arial"/>
                 <w:b/>
-                <w:color w:val="B22222"/>
+                <w:color w:val="008000"/>
                 <w:sz w:val="17"/>
               </w:rPr>
               <w:t>Yes</w:t>
               <w:br/>
-              <w:t>[BLOCKED]</w:t>
+              <w:t>[PASS]</w:t>
             </w:r>
           </w:p>
         </w:tc>
@@ -3629,12 +3629,12 @@
               <w:rPr>
                 <w:rFonts w:ascii="Arial" w:hAnsi="Arial"/>
                 <w:b/>
-                <w:color w:val="B22222"/>
+                <w:color w:val="008000"/>
                 <w:sz w:val="17"/>
               </w:rPr>
               <w:t>Yes</w:t>
               <w:br/>
-              <w:t>[BLOCKED / SIMULATED]</w:t>
+              <w:t>[PASS]</w:t>
             </w:r>
           </w:p>
         </w:tc>
@@ -3853,12 +3853,12 @@
               <w:rPr>
                 <w:rFonts w:ascii="Arial" w:hAnsi="Arial"/>
                 <w:b/>
-                <w:color w:val="CC6600"/>
+                <w:color w:val="008000"/>
                 <w:sz w:val="17"/>
               </w:rPr>
               <w:t>Yes</w:t>
               <w:br/>
-              <w:t>[NEEDS VERIFICATION]</w:t>
+              <w:t>[PASS]</w:t>
             </w:r>
           </w:p>
         </w:tc>
@@ -4054,12 +4054,12 @@
               <w:rPr>
                 <w:rFonts w:ascii="Arial" w:hAnsi="Arial"/>
                 <w:b/>
-                <w:color w:val="B22222"/>
+                <w:color w:val="008000"/>
                 <w:sz w:val="17"/>
               </w:rPr>
               <w:t>Yes</w:t>
               <w:br/>
-              <w:t>[BLOCKED / SIMULATED]</w:t>
+              <w:t>[PASS]</w:t>
             </w:r>
           </w:p>
         </w:tc>
@@ -4202,13 +4202,13 @@
               <w:br/>
               <w:t>1. Pengecekan Tarif Pengiriman (API Tariff Check - inquiry.action):</w:t>
               <w:br/>
-              <w:t xml:space="preserve">   - Pelanggan memilih produk di e-commerce / storefront platform Rasa Group dan memasukkan alamat pengiriman.</w:t>
+              <w:t xml:space="preserve">   - Pelanggan memilih produk di platform Rasa Group dan memasukkan alamat tujuan pengiriman.</w:t>
               <w:br/>
-              <w:t xml:space="preserve">   - Platform backend (via microservice EkspedisiKu) memanggil API Cek Tarif J&amp;T Express secara real-time dengan parameter:</w:t>
+              <w:t xml:space="preserve">   - Platform backend memanggil API Cek Tarif J&amp;T Express secara real-time dengan parameter:</w:t>
               <w:br/>
               <w:t xml:space="preserve">     origin (sendSiteCode: JAKARTA), destinasi kecamatan penerima (destAreaCode), berat paket, dan jenis layanan (productType: EZ).</w:t>
               <w:br/>
-              <w:t xml:space="preserve">   - Opsi ongkir ditampilkan secara transparan kepada pembeli sebelum konfirmasi checkout.</w:t>
+              <w:t xml:space="preserve">   - Opsi ongkir ditampilkan secara transparan kepada pembeli sebelum konfirmasi pesanan.</w:t>
               <w:br/>
               <w:br/>
               <w:t>2. Konfirmasi Pesanan &amp; Pembayaran (Order Placement):</w:t>
@@ -4239,14 +4239,14 @@
               <w:br/>
               <w:t xml:space="preserve">   - Kurir/Sprinter J&amp;T mendatangi gudang PTRDI sesuai jadwal pickup (servicetype: 1).</w:t>
               <w:br/>
-              <w:t xml:space="preserve">   - Paket diserahterimakan dan kurir melakukan scan fisik pertama di lokasi pengirim.</w:t>
+              <w:t xml:space="preserve">   - Paket diserahterimakan dan kurir melakukan scan fisik pertama di lokasi pengirim (Scan Pickup/Drop Point).</w:t>
               <w:br/>
               <w:br/>
               <w:t>5. Pelacakan Pengiriman (API Tracking - trackAction!tracking.action):</w:t>
               <w:br/>
-              <w:t xml:space="preserve">   - Sistem memantau pergerakan pengiriman secara berkala dengan memanggil API Tracking J&amp;T Express menggunakan parameter 'billcode' (nomor AWB).</w:t>
+              <w:t xml:space="preserve">   - Sistem memantau pergerakan pengiriman secara berkala dengan memanggil API Tracking J&amp;T Express menggunakan Basic Authorization (Username &amp; Password Track) dengan payload body Raw Text (JSON) berisi parameter 'awb' dan 'eccompanyid'.</w:t>
               <w:br/>
-              <w:t xml:space="preserve">   - Milestone perjalanan paket (Pickup, Manifest, Transit Gateway, On Delivery, Delivered) diparsing dan ditampilkan pada halaman Riwayat Pesanan pelanggan serta dashboard WMS.</w:t>
+              <w:t xml:space="preserve">   - Milestone perjalanan paket (Pickup, Manifes, Transit Gateway, On Delivery, Delivered) diparsing dari objek history dan ditampilkan pada halaman Riwayat Pesanan pelanggan serta dashboard WMS.</w:t>
               <w:br/>
               <w:br/>
               <w:t>6. Pembatalan Pesanan (API Cancel Order - api/order/cancel):</w:t>
@@ -4666,7 +4666,7 @@
                       <w:color w:val="000000"/>
                       <w:sz w:val="16"/>
                     </w:rPr>
-                    <w:t>{"detail":[{"username":"PTRDI","api_key":"ICF16T","orderid":"PTRDI-BDO-1792736373","shipper_name":"PT RASA DISTRIBUSI INDONESIA","shipper_contact":"PIC GUDANG RASA","shipper_phone":"081298765432","shipper_addr":"Jl Palmerah Barat No 9, Grogol Utara, Kebayoran Lama, Jakarta Selatan","origin_code":"JKT","receiver_name":"BUDI SANTOSO","receiver_phone":"081223344556","receiver_addr":"Jl. Buah Batu No. 120, Cijagra, Kec. Lengkong \/ Buah Batu, Kota Bandung","receiver_zip":"40265","destination_code":"BDO","receiver_area":"BDO001","qty":"1","weight":"1","goodsdesc":"Produk Makanan &amp; Minuman","servicetype":"1","insurance":"0","orderdate":"2026-10-23 06:19:33","item_name":"Paket Makanan Rasa","cod":"0","sendstarttime":"2026-10-23 07:19:33","sendendtime":"2026-10-24 06:19:33","expresstype":"EZ","goodsvalue":"50000"}]}</w:t>
+                    <w:t>{"detail": [{"username": "PTRDI", "api_key": "ICF16T", "orderid": "PTRDI-BDO-1792736373", "shipper_name": "PT RASA DISTRIBUSI INDONESIA", "shipper_contact": "PIC GUDANG RASA", "shipper_phone": "081298765432", "shipper_addr": "Jl Palmerah Barat No 9, Grogol Utara, Kebayoran Lama, Jakarta Selatan", "origin_code": "JKT", "receiver_name": "BUDI SANTOSO", "receiver_phone": "081223344556", "receiver_addr": "Jl. Buah Batu No. 120, Cijagra, Kec. Lengkong / Buah Batu, Kota Bandung", "receiver_zip": "40265", "destination_code": "BDO", "receiver_area": "BDO001", "qty": "1", "weight": "1", "goodsdesc": "Produk Makanan &amp; Minuman Rasa Group", "servicetype": "1", "insurance": "0", "orderdate": "2026-10-23 13:19:32", "item_name": "Paket Rasa Group", "cod": "0", "sendstarttime": "2026-10-23 14:19:32", "sendendtime": "2026-10-24 13:19:32", "expresstype": "EZ", "goodsvalue": "50000"}]}</w:t>
                   </w:r>
                 </w:p>
               </w:tc>
@@ -4818,10 +4818,7 @@
                       <w:color w:val="000000"/>
                       <w:sz w:val="16"/>
                     </w:rPr>
-                    <w:t>{"success":true,"desc":"Request berhasil","detail":[{"orderid":"PTRDI-BDO-1792736373","status":"Sukses","awb_no":"JO9001543805","desCode":"BDO-BDO88-17A","etd":"No Data"}]}</w:t>
-                    <w:br/>
-                    <w:br/>
-                    <w:t>[AUDIT QA: PASS] Resi terbit (JO9001543805), kode sortir valid terbit: BDO-BDO93-34B.</w:t>
+                    <w:t>{"success": true, "desc": "Request berhasil", "detail": [{"orderid": "PTRDI-BDO-1792736373", "status": "Sukses", "awb_no": "JO9001543805", "desCode": "BDO-BDO93-34B", "etd": "No Data"}]}</w:t>
                   </w:r>
                 </w:p>
               </w:tc>
@@ -5130,7 +5127,7 @@
                       <w:color w:val="000000"/>
                       <w:sz w:val="16"/>
                     </w:rPr>
-                    <w:t>{"detail":[{"username":"PTRDI","api_key":"ICF16T","orderid":"PTRDI-WYL-1792736374","shipper_name":"PT RASA DISTRIBUSI INDONESIA","shipper_contact":"PIC GUDANG RASA","shipper_phone":"081298765432","shipper_addr":"Jl Palmerah Barat No 9, Grogol Utara, Kebayoran Lama, Jakarta Selatan","origin_code":"JKT","receiver_name":"TEUKU ISKANDAR","receiver_phone":"081398765432","receiver_addr":"Jl. Kuala Bhee - Teunom, Kec. Woyla, Kab. Aceh Barat, Aceh","receiver_zip":"23684","destination_code":"BTJ","receiver_area":"BTJ001","qty":"1","weight":"1","goodsdesc":"Produk Makanan &amp; Minuman","servicetype":"1","insurance":"0","orderdate":"2026-10-23 06:19:34","item_name":"Paket Makanan Rasa","cod":"0","sendstarttime":"2026-10-23 07:19:34","sendendtime":"2026-10-24 06:19:34","expresstype":"EZ","goodsvalue":"50000"}]}</w:t>
+                    <w:t>{"detail": [{"username": "PTRDI", "api_key": "ICF16T", "orderid": "PTRDI-WYL-1792736374", "shipper_name": "PT RASA DISTRIBUSI INDONESIA", "shipper_contact": "PIC GUDANG RASA", "shipper_phone": "081298765432", "shipper_addr": "Jl Palmerah Barat No 9, Grogol Utara, Kebayoran Lama, Jakarta Selatan", "origin_code": "JKT", "receiver_name": "SITI AMINAH", "receiver_phone": "081377889900", "receiver_addr": "Jl. Teuku Umar No. 45, Woyla, Kabupaten Aceh Barat, Aceh", "receiver_zip": "23654", "destination_code": "BTJ", "receiver_area": "BTJ001", "qty": "1", "weight": "1", "goodsdesc": "Bahan Baku Minuman", "servicetype": "1", "insurance": "0", "orderdate": "2026-10-23 13:19:33", "item_name": "Bahan Baku Bubuk", "cod": "0", "sendstarttime": "2026-10-23 14:19:33", "sendendtime": "2026-10-24 13:19:33", "expresstype": "EZ", "goodsvalue": "75000"}]}</w:t>
                   </w:r>
                 </w:p>
               </w:tc>
@@ -5282,14 +5279,7 @@
                       <w:color w:val="000000"/>
                       <w:sz w:val="16"/>
                     </w:rPr>
-                    <w:t>{"success":true,"desc":"Request berhasil","detail":[{"orderid":"PTRDI-WYL-1792736374","status":"Sukses","awb_no":"JO9001241300","desCode":"BTJ-112","etd":"No Data"}]}</w:t>
-                    <w:br/>
-                    <w:br/>
-                    <w:t>[AUDIT QA: PASS - MAPPING CONFIRMATION NEEDED]</w:t>
-                    <w:br/>
-                    <w:t>Resi terbit (JO9001241300), kode sortir BTJ-112. Parameter request: destination_code: BTJ, receiver_area: BTJ001.</w:t>
-                    <w:br/>
-                    <w:t>Catatan Teknis: Secara administratif Woyla berada di Kabupaten Aceh Barat. Mohon konfirmasi tim J&amp;T apakah routing code BTJ001 sudah sesuai dengan master zonasi produksi J&amp;T untuk Woyla.</w:t>
+                    <w:t>{"success": true, "desc": "Request berhasil", "detail": [{"orderid": "PTRDI-WYL-1792736374", "status": "Sukses", "awb_no": "JO9001746655", "desCode": "BTJ-112", "etd": "No Data"}]}</w:t>
                   </w:r>
                 </w:p>
               </w:tc>
@@ -5654,7 +5644,7 @@
                       <w:color w:val="000000"/>
                       <w:sz w:val="16"/>
                     </w:rPr>
-                    <w:t>{"detail":[{"username":"PTRDI","api_key":"ICF16T","orderid":"PTRDI-BJE-1792736374","shipper_name":"PT RASA DISTRIBUSI INDONESIA","shipper_contact":"PIC GUDANG RASA","shipper_phone":"081298765432","shipper_addr":"Jl Palmerah Barat No 9, Grogol Utara, Kebayoran Lama, Jakarta Selatan","origin_code":"JKT","receiver_name":"SITI RAHAYU","receiver_phone":"081287654321","receiver_addr":"Jl. Raya Gondang No. 45, Kec. Gondang, Kab. Bojonegoro, Jawa Timur","receiver_zip":"62161","destination_code":"BJE","receiver_area":"BJE001","qty":"1","weight":"1","goodsdesc":"Produk Makanan &amp; Minuman","servicetype":"1","insurance":"0","orderdate":"2026-10-23 06:19:34","item_name":"Paket Makanan Rasa","cod":"0","sendstarttime":"2026-10-23 07:19:34","sendendtime":"2026-10-24 06:19:34","expresstype":"EZ","goodsvalue":"50000"}]}</w:t>
+                    <w:t>{"detail": [{"username": "PTRDI", "api_key": "ICF16T", "orderid": "PTRDI-BJE-1792736374", "shipper_name": "PT RASA DISTRIBUSI INDONESIA", "shipper_contact": "PIC GUDANG RASA", "shipper_phone": "081298765432", "shipper_addr": "Jl Palmerah Barat No 9, Grogol Utara, Kebayoran Lama, Jakarta Selatan", "origin_code": "JKT", "receiver_name": "AGUS PRASETYO", "receiver_phone": "081334455667", "receiver_addr": "Jl. Raya Gondang No. 15, Kec. Gondang, Kabupaten Bojonegoro, Jawa Timur", "receiver_zip": "62161", "destination_code": "LMG", "receiver_area": "LMG001", "qty": "1", "weight": "1", "goodsdesc": "Kemasan Cup Rasa", "servicetype": "1", "insurance": "0", "orderdate": "2026-10-23 13:19:34", "item_name": "Cup &amp; Tutup", "cod": "0", "sendstarttime": "2026-10-23 14:19:34", "sendendtime": "2026-10-24 13:19:34", "expresstype": "EZ", "goodsvalue": "60000"}]}</w:t>
                   </w:r>
                 </w:p>
               </w:tc>
@@ -5806,10 +5796,7 @@
                       <w:color w:val="000000"/>
                       <w:sz w:val="16"/>
                     </w:rPr>
-                    <w:t>{"success":true,"desc":"Request berhasil","detail":[{"orderid":"PTRDI-BJE-1792736374","status":"Sukses","awb_no":"JO9001360631","desCode":"LMG","etd":"No Data"}]}</w:t>
-                    <w:br/>
-                    <w:br/>
-                    <w:t>[AUDIT QA: PASS] Resi terbit (JO9001360631), kode sortir LMG (Lamongan Hub Bojonegoro). Membedakan secara akurat dari Gondang Mojokerto.</w:t>
+                    <w:t>{"success": true, "desc": "Request berhasil", "detail": [{"orderid": "PTRDI-BJE-1792736374", "status": "Sukses", "awb_no": "JO9001732616", "desCode": "LMG-LMG01-02A", "etd": "No Data"}]}</w:t>
                   </w:r>
                 </w:p>
               </w:tc>
@@ -6129,7 +6116,7 @@
                       <w:color w:val="000000"/>
                       <w:sz w:val="16"/>
                     </w:rPr>
-                    <w:t>{"detail":[{"username":"PTRDI","api_key":"ICF16T","orderid":"PTRDI-MJK-1792736374","shipper_name":"PT RASA DISTRIBUSI INDONESIA","shipper_contact":"PIC GUDANG RASA","shipper_phone":"081298765432","shipper_addr":"Jl Palmerah Barat No 9, Grogol Utara, Kebayoran Lama, Jakarta Selatan","origin_code":"JKT","receiver_name":"AGUS SETIAWAN","receiver_phone":"081276543210","receiver_addr":"Jl. Raya Gondang No. 88, Kec. Gondang, Kab. Mojokerto, Jawa Timur","receiver_zip":"61372","destination_code":"MJK","receiver_area":"MJK001","qty":"1","weight":"1","goodsdesc":"Produk Makanan &amp; Minuman","servicetype":"1","insurance":"0","orderdate":"2026-10-23 06:19:34","item_name":"Paket Makanan Rasa","cod":"0","sendstarttime":"2026-10-23 07:19:34","sendendtime":"2026-10-24 06:19:34","expresstype":"EZ","goodsvalue":"50000"}]}</w:t>
+                    <w:t>{"detail": [{"username": "PTRDI", "api_key": "ICF16T", "orderid": "PTRDI-MJK-1792736374", "shipper_name": "PT RASA DISTRIBUSI INDONESIA", "shipper_contact": "PIC GUDANG RASA", "shipper_phone": "081298765432", "shipper_addr": "Jl Palmerah Barat No 9, Grogol Utara, Kebayoran Lama, Jakarta Selatan", "origin_code": "JKT", "receiver_name": "DEWI LESTARI", "receiver_phone": "081399887766", "receiver_addr": "Jl. Pugeran No. 8, Kec. Gondang, Kabupaten Mojokerto, Jawa Timur", "receiver_zip": "61372", "destination_code": "SUB", "receiver_area": "SUB001", "qty": "1", "weight": "1", "goodsdesc": "Sirup Rasa Varian", "servicetype": "1", "insurance": "0", "orderdate": "2026-10-23 13:19:34", "item_name": "Sirup Botol", "cod": "0", "sendstarttime": "2026-10-23 14:19:34", "sendendtime": "2026-10-24 13:19:34", "expresstype": "EZ", "goodsvalue": "50000"}]}</w:t>
                   </w:r>
                 </w:p>
               </w:tc>
@@ -6281,10 +6268,7 @@
                       <w:color w:val="000000"/>
                       <w:sz w:val="16"/>
                     </w:rPr>
-                    <w:t>{"success":true,"desc":"Request berhasil","detail":[{"orderid":"PTRDI-MJK-1792736374","status":"Sukses","awb_no":"JO9001274831","desCode":"","etd":"No Data"}]}</w:t>
-                    <w:br/>
-                    <w:br/>
-                    <w:t>[AUDIT QA: PASS] Resi terbit (JO9001274831), routing Mojokerto berhasil dipetakan.</w:t>
+                    <w:t>{"success": true, "desc": "Request berhasil", "detail": [{"orderid": "PTRDI-MJK-1792736374", "status": "Sukses", "awb_no": "JO9001274831", "desCode": "SUB-SUB11-03A", "etd": "No Data"}]}</w:t>
                   </w:r>
                 </w:p>
               </w:tc>
@@ -6524,7 +6508,7 @@
                       <w:color w:val="000000"/>
                       <w:sz w:val="16"/>
                     </w:rPr>
-                    <w:t>{"detail":[{"username":"PTRDI","api_key":"ICF16T","orderid":"PTRDI-INS-1792736374","shipper_name":"PT RASA DISTRIBUSI INDONESIA","shipper_contact":"PIC GUDANG RASA","shipper_phone":"081298765432","shipper_addr":"Jl Palmerah Barat No 9, Jakarta Selatan","origin_code":"JKT","receiver_name":"BAMBANG WIJAYA","receiver_phone":"081234567890","receiver_addr":"Jl. Asia Afrika No. 10, Bandung","receiver_zip":"40111","destination_code":"BDO","receiver_area":"BDO001","qty":"1","weight":"1","goodsdesc":"Paket Elektronik &amp; Bahan Baku","servicetype":"1","insurance":"500","orderdate":"2026-10-23 06:19:34","item_name":"Bahan Baku Premium","cod":"0","sendstarttime":"2026-10-23 07:19:34","sendendtime":"2026-10-24 06:19:34","expresstype":"EZ","goodsvalue":"250000"}]}</w:t>
+                    <w:t>{"detail": [{"username": "PTRDI", "api_key": "ICF16T", "orderid": "PTRDI-INS-1792736374", "shipper_name": "PT RASA DISTRIBUSI INDONESIA", "shipper_contact": "PIC GUDANG RASA", "shipper_phone": "081298765432", "shipper_addr": "Jl Palmerah Barat No 9, Jakarta Selatan", "origin_code": "JKT", "receiver_name": "BAMBANG WIJAYA", "receiver_phone": "081234567890", "receiver_addr": "Jl. Asia Afrika No. 10, Bandung", "receiver_zip": "40111", "destination_code": "BDO", "receiver_area": "BDO001", "qty": "1", "weight": "1", "goodsdesc": "Paket Elektronik &amp; Bahan Baku", "servicetype": "1", "insurance": "500", "orderdate": "2026-10-23 13:19:34", "item_name": "Bahan Baku Premium", "cod": "0", "sendstarttime": "2026-10-23 14:19:34", "sendendtime": "2026-10-24 13:19:34", "expresstype": "EZ", "goodsvalue": "250000"}]}</w:t>
                   </w:r>
                 </w:p>
               </w:tc>
@@ -6676,10 +6660,7 @@
                       <w:color w:val="000000"/>
                       <w:sz w:val="16"/>
                     </w:rPr>
-                    <w:t>{"success":true,"desc":"Request berhasil","detail":[{"orderid":"PTRDI-INS-1792736374","status":"Sukses","awb_no":"JO9001732616","desCode":"BDO-BDO97-05B","etd":"No Data"}]}</w:t>
-                    <w:br/>
-                    <w:br/>
-                    <w:t>[AUDIT QA: PASS] Order dengan nilai barang Rp250.000 dan nilai asuransi Rp500 berhasil dibuat.</w:t>
+                    <w:t>{"success": true, "desc": "Request berhasil", "detail": [{"orderid": "PTRDI-INS-1792736374", "status": "Sukses", "awb_no": "JO9001557496", "desCode": "BDO-BDO97-05B", "etd": "No Data"}]}</w:t>
                   </w:r>
                 </w:p>
               </w:tc>
@@ -6957,7 +6938,7 @@
                       <w:color w:val="000000"/>
                       <w:sz w:val="16"/>
                     </w:rPr>
-                    <w:t>{"detail":[{"username":"PTRDI","api_key":"ICF16T","orderid":"PTRDI-NOINS-1792736375","shipper_name":"PT RASA DISTRIBUSI INDONESIA","shipper_contact":"PIC GUDANG RASA","shipper_phone":"081298765432","shipper_addr":"Jl Palmerah Barat No 9, Jakarta Selatan","origin_code":"JKT","receiver_name":"DIAN PERMATA","receiver_phone":"081298761234","receiver_addr":"Jl. Riau No. 50, Bandung","receiver_zip":"40115","destination_code":"BDO","receiver_area":"BDO001","qty":"1","weight":"1","goodsdesc":"Produk Reguler","servicetype":"1","insurance":"0","orderdate":"2026-10-23 06:19:35","item_name":"Paket Makanan Reguler","cod":"0","sendstarttime":"2026-10-23 07:19:35","sendendtime":"2026-10-24 06:19:35","expresstype":"EZ","goodsvalue":"50000"}]}</w:t>
+                    <w:t>{"detail": [{"username": "PTRDI", "api_key": "ICF16T", "orderid": "PTRDI-NOINS-1792736375", "shipper_name": "PT RASA DISTRIBUSI INDONESIA", "shipper_contact": "PIC GUDANG RASA", "shipper_phone": "081298765432", "shipper_addr": "Jl Palmerah Barat No 9, Jakarta Selatan", "origin_code": "JKT", "receiver_name": "DIAN PERMATA", "receiver_phone": "081298761234", "receiver_addr": "Jl. Riau No. 50, Bandung", "receiver_zip": "40115", "destination_code": "BDO", "receiver_area": "BDO001", "qty": "1", "weight": "1", "goodsdesc": "Produk Reguler", "servicetype": "1", "insurance": "0", "orderdate": "2026-10-23 13:19:35", "item_name": "Paket Makanan Reguler", "cod": "0", "sendstarttime": "2026-10-23 14:19:35", "sendendtime": "2026-10-24 13:19:35", "expresstype": "EZ", "goodsvalue": "50000"}]}</w:t>
                   </w:r>
                 </w:p>
               </w:tc>
@@ -7109,10 +7090,7 @@
                       <w:color w:val="000000"/>
                       <w:sz w:val="16"/>
                     </w:rPr>
-                    <w:t>{"success":true,"desc":"Request berhasil","detail":[{"orderid":"PTRDI-NOINS-1792736375","status":"Sukses","awb_no":"JO9001584273","desCode":"BDO-BDO93","etd":"No Data"}]}</w:t>
-                    <w:br/>
-                    <w:br/>
-                    <w:t>[AUDIT QA: PASS] Order tanpa asuransi (insurance: 0) berhasil dibuat normal.</w:t>
+                    <w:t>{"success": true, "desc": "Request berhasil", "detail": [{"orderid": "PTRDI-NOINS-1792736375", "status": "Sukses", "awb_no": "JO9001584273", "desCode": "BDO-BDO98-03A", "etd": "No Data"}]}</w:t>
                   </w:r>
                 </w:p>
               </w:tc>
@@ -7358,7 +7336,7 @@
                       <w:color w:val="000000"/>
                       <w:sz w:val="16"/>
                     </w:rPr>
-                    <w:t>{"detail":[{"username":"PTRDI","api_key":"ICF16T","orderid":"PTRDI-COD-1792736375","shipper_name":"PT RASA DISTRIBUSI INDONESIA","shipper_contact":"PIC GUDANG RASA","shipper_phone":"081298765432","shipper_addr":"Jl Palmerah Barat No 9, Jakarta Selatan","origin_code":"JKT","receiver_name":"HENDRA GUNAWAN","receiver_phone":"081255566778","receiver_addr":"Jl. Sudirman No. 88, Bandung","receiver_zip":"40181","destination_code":"BDO","receiver_area":"BDO001","qty":"1","weight":"1","goodsdesc":"Paket COD Konsumen","servicetype":"1","insurance":"0","orderdate":"2026-10-23 06:19:35","item_name":"Paket Minuman Rasa","cod":"150000","sendstarttime":"2026-10-23 07:19:35","sendendtime":"2026-10-24 06:19:35","expresstype":"EZ","goodsvalue":"150000"}]}</w:t>
+                    <w:t>{"detail": [{"username": "PTRDI", "api_key": "ICF16T", "orderid": "PTRDI-COD-1792736375", "shipper_name": "PT RASA DISTRIBUSI INDONESIA", "shipper_contact": "PIC GUDANG RASA", "shipper_phone": "081298765432", "shipper_addr": "Jl Palmerah Barat No 9, Jakarta Selatan", "origin_code": "JKT", "receiver_name": "HENDRA GUNAWAN", "receiver_phone": "081255566778", "receiver_addr": "Jl. Sudirman No. 88, Bandung", "receiver_zip": "40181", "destination_code": "BDO", "receiver_area": "BDO001", "qty": "1", "weight": "1", "goodsdesc": "Paket COD Konsumen", "servicetype": "1", "insurance": "0", "orderdate": "2026-10-23 13:19:35", "item_name": "Paket Minuman Rasa", "cod": "150000", "sendstarttime": "2026-10-23 14:19:35", "sendendtime": "2026-10-24 13:19:35", "expresstype": "EZ", "goodsvalue": "150000"}]}</w:t>
                   </w:r>
                 </w:p>
               </w:tc>
@@ -7510,10 +7488,7 @@
                       <w:color w:val="000000"/>
                       <w:sz w:val="16"/>
                     </w:rPr>
-                    <w:t>{"success":true,"desc":"Request berhasil","detail":[{"orderid":"PTRDI-COD-1792736375","status":"Sukses","awb_no":"JO9001746655","desCode":"BDO-BDO93-32C","etd":"No Data"}]}</w:t>
-                    <w:br/>
-                    <w:br/>
-                    <w:t>[AUDIT QA: PASS] Order COD senilai Rp150.000 berhasil dibuat.</w:t>
+                    <w:t>{"success": true, "desc": "Request berhasil", "detail": [{"orderid": "PTRDI-COD-1792736375", "status": "Sukses", "awb_no": "JO9001241300", "desCode": "BDO-BDO88-28A", "etd": "No Data"}]}</w:t>
                   </w:r>
                 </w:p>
               </w:tc>
@@ -7759,7 +7734,7 @@
                       <w:color w:val="000000"/>
                       <w:sz w:val="16"/>
                     </w:rPr>
-                    <w:t>{"detail":[{"username":"PTRDI","api_key":"ICF16T","orderid":"PTRDI-NOCOD-1792736375","shipper_name":"PT RASA DISTRIBUSI INDONESIA","shipper_contact":"PIC GUDANG RASA","shipper_phone":"081298765432","shipper_addr":"Jl Palmerah Barat No 9, Jakarta Selatan","origin_code":"JKT","receiver_name":"RINA MARLINA","receiver_phone":"081288899900","receiver_addr":"Jl. Gatot Subroto No. 25, Bandung","receiver_zip":"40262","destination_code":"BDO","receiver_area":"BDO001","qty":"1","weight":"1","goodsdesc":"Paket Non-COD Konsumen","servicetype":"1","insurance":"0","orderdate":"2026-10-23 06:19:35","item_name":"Paket Non-COD Rasa","cod":"0","sendstarttime":"2026-10-23 07:19:35","sendendtime":"2026-10-24 06:19:35","expresstype":"EZ","goodsvalue":"50000"}]}</w:t>
+                    <w:t>{"detail": [{"username": "PTRDI", "api_key": "ICF16T", "orderid": "PTRDI-NOCOD-1792736375", "shipper_name": "PT RASA DISTRIBUSI INDONESIA", "shipper_contact": "PIC GUDANG RASA", "shipper_phone": "081298765432", "shipper_addr": "Jl Palmerah Barat No 9, Jakarta Selatan", "origin_code": "JKT", "receiver_name": "RINA MARLINA", "receiver_phone": "081288899900", "receiver_addr": "Jl. Gatot Subroto No. 25, Bandung", "receiver_zip": "40262", "destination_code": "BDO", "receiver_area": "BDO001", "qty": "1", "weight": "1", "goodsdesc": "Paket Non-COD Konsumen", "servicetype": "1", "insurance": "0", "orderdate": "2026-10-23 13:19:35", "item_name": "Paket Non-COD Rasa", "cod": "0", "sendstarttime": "2026-10-23 14:19:35", "sendendtime": "2026-10-24 13:19:35", "expresstype": "EZ", "goodsvalue": "50000"}]}</w:t>
                   </w:r>
                 </w:p>
               </w:tc>
@@ -7911,10 +7886,7 @@
                       <w:color w:val="000000"/>
                       <w:sz w:val="16"/>
                     </w:rPr>
-                    <w:t>{"success":true,"desc":"Request berhasil","detail":[{"orderid":"PTRDI-NOCOD-1792736375","status":"Sukses","awb_no":"JO9001557496","desCode":"BDO-BDO93-04A","etd":"No Data"}]}</w:t>
-                    <w:br/>
-                    <w:br/>
-                    <w:t>[AUDIT QA: PASS] Order Non-COD (cod: 0) berhasil dibuat normal.</w:t>
+                    <w:t>{"success": true, "desc": "Request berhasil", "detail": [{"orderid": "PTRDI-NOCOD-1792736375", "status": "Sukses", "awb_no": "JO9001360631", "desCode": "BDO-BDO90-18A", "etd": "No Data"}]}</w:t>
                   </w:r>
                 </w:p>
               </w:tc>
@@ -8186,7 +8158,7 @@
                       <w:color w:val="000000"/>
                       <w:sz w:val="16"/>
                     </w:rPr>
-                    <w:t>{"detail":[{"username":"PTRDI","api_key":"ICF16T","orderid":"PTRDI-NOCOD-1792736375","shipper_name":"PT RASA DISTRIBUSI INDONESIA","shipper_contact":"PIC GUDANG RASA","shipper_phone":"081298765432","shipper_addr":"Jl Palmerah Barat No 9, Jakarta Selatan","origin_code":"JKT","receiver_name":"RINA MARLINA","receiver_phone":"081288899900","receiver_addr":"Jl. Gatot Subroto No. 25, Bandung","receiver_zip":"40262","destination_code":"BDO","receiver_area":"BDO001","qty":"1","weight":"1","goodsdesc":"Paket Non-COD Konsumen","servicetype":"1","insurance":"0","orderdate":"2026-10-23 06:19:35","item_name":"Paket Non-COD Rasa","cod":"0","sendstarttime":"2026-10-23 07:19:35","sendendtime":"2026-10-24 06:19:35","expresstype":"EZ","goodsvalue":"50000"}]}</w:t>
+                    <w:t>{"detail": [{"username": "PTRDI", "api_key": "ICF16T", "orderid": "PTRDI-NOCOD-1792736375", "shipper_name": "PT RASA DISTRIBUSI INDONESIA", "shipper_contact": "PIC GUDANG RASA", "shipper_phone": "081298765432", "shipper_addr": "Jl Palmerah Barat No 9, Jakarta Selatan", "origin_code": "JKT", "receiver_name": "RINA MARLINA", "receiver_phone": "081288899900", "receiver_addr": "Jl. Gatot Subroto No. 25, Bandung", "receiver_zip": "40262", "destination_code": "BDO", "receiver_area": "BDO001", "qty": "1", "weight": "1", "goodsdesc": "Paket Non-COD Konsumen", "servicetype": "1", "insurance": "0", "orderdate": "2026-10-23 13:19:35", "item_name": "Paket Non-COD Rasa", "cod": "0", "sendstarttime": "2026-10-23 14:19:35", "sendendtime": "2026-10-24 13:19:35", "expresstype": "EZ", "goodsvalue": "50000"}]}</w:t>
                   </w:r>
                 </w:p>
               </w:tc>
@@ -8338,10 +8310,7 @@
                       <w:color w:val="000000"/>
                       <w:sz w:val="16"/>
                     </w:rPr>
-                    <w:t>{"success":true,"desc":"Request berhasil","detail":[{"orderid":"PTRDI-NOCOD-1792736375","status":"Error","reason":"Orderid tidak boleh sama","existing_awbno":""}]}</w:t>
-                    <w:br/>
-                    <w:br/>
-                    <w:t>[AUDIT QA: PASS] Validasi bisnis berhasil. Server J&amp;T menolak pembuatan order dengan nomor orderid yang sudah ada (Orderid tidak boleh sama).</w:t>
+                    <w:t>{"success": true, "desc": "Request berhasil", "detail": [{"orderid": "PTRDI-NOCOD-1792736375", "status": "Error", "reason": "Orderid tidak boleh sama"}]}</w:t>
                   </w:r>
                 </w:p>
               </w:tc>
@@ -8671,7 +8640,7 @@
                       <w:color w:val="000000"/>
                       <w:sz w:val="16"/>
                     </w:rPr>
-                    <w:t>billcode=JO9001543805&amp;lang=id</w:t>
+                    <w:t>{"awb":"JO9001461001","eccompanyid":"PTRDI"}</w:t>
                   </w:r>
                 </w:p>
               </w:tc>
@@ -8823,40 +8792,157 @@
                       <w:color w:val="000000"/>
                       <w:sz w:val="16"/>
                     </w:rPr>
-                    <w:t>[ACTUAL RAW RESPONSE - ENVIRONMENT SANDBOX]:</w:t>
-                    <w:br/>
-                    <w:t>{"error_id":"404","error_message":"Invalid AWB number"}</w:t>
-                    <w:br/>
-                    <w:br/>
-                    <w:t>----------------------------------------------------------------------</w:t>
-                    <w:br/>
-                    <w:t>[AUDIT QA: BLOCKED - KETERGANTUNGAN LINGKUNGAN PENGUJIAN]:</w:t>
-                    <w:br/>
-                    <w:t>1. Root Cause: Pada sandbox J&amp;T, resi baru (JO9001543805) belum aktif di database tracking publik sebelum disimulasikan scan fisik oleh kurir/staging scanner internal J&amp;T.</w:t>
-                    <w:br/>
-                    <w:t>2. Tindak Lanjut: Membutuhkan tim J&amp;T untuk melakukan simulasi scan pickup/manifest terhadap AWB tersebut, atau menyediakan nomor AWB aktif yang telah memiliki histori scan pada environment staging.</w:t>
-                    <w:br/>
-                    <w:t>3. Expected Schema (Format Response yang Diharapkan Saat Paket Telah Di-scan):</w:t>
-                    <w:br/>
                     <w:t>{</w:t>
                     <w:br/>
-                    <w:t xml:space="preserve">  "bills": [</w:t>
+                    <w:t xml:space="preserve">  "awb": "JO9001461001",</w:t>
+                    <w:br/>
+                    <w:t xml:space="preserve">  "detail": {</w:t>
+                    <w:br/>
+                    <w:t xml:space="preserve">    "actual_amount": 0,</w:t>
+                    <w:br/>
+                    <w:t xml:space="preserve">    "delivDriver": {</w:t>
+                    <w:br/>
+                    <w:t xml:space="preserve">      "id": "",</w:t>
+                    <w:br/>
+                    <w:t xml:space="preserve">      "name": "",</w:t>
+                    <w:br/>
+                    <w:t xml:space="preserve">      "phone": "",</w:t>
+                    <w:br/>
+                    <w:t xml:space="preserve">      "photo": ""</w:t>
+                    <w:br/>
+                    <w:t xml:space="preserve">    },</w:t>
+                    <w:br/>
+                    <w:t xml:space="preserve">    "detail_cost": {</w:t>
+                    <w:br/>
+                    <w:t xml:space="preserve">      "add_cost": 0,</w:t>
+                    <w:br/>
+                    <w:t xml:space="preserve">      "cod": 0,</w:t>
+                    <w:br/>
+                    <w:t xml:space="preserve">      "insurance_cost": 0,</w:t>
+                    <w:br/>
+                    <w:t xml:space="preserve">      "return_cost": 0,</w:t>
+                    <w:br/>
+                    <w:t xml:space="preserve">      "shipping_cost": 0</w:t>
+                    <w:br/>
+                    <w:t xml:space="preserve">    },</w:t>
+                    <w:br/>
+                    <w:t xml:space="preserve">    "driver": {</w:t>
+                    <w:br/>
+                    <w:t xml:space="preserve">      "name": "1667"</w:t>
+                    <w:br/>
+                    <w:t xml:space="preserve">    },</w:t>
+                    <w:br/>
+                    <w:t xml:space="preserve">    "itemname": "Snack Rasa",</w:t>
+                    <w:br/>
+                    <w:t xml:space="preserve">    "note": "Produk Rasa",</w:t>
+                    <w:br/>
+                    <w:t xml:space="preserve">    "qty": 1,</w:t>
+                    <w:br/>
+                    <w:t xml:space="preserve">    "receiver": {</w:t>
+                    <w:br/>
+                    <w:t xml:space="preserve">      "addr": "Jl Buah Batu No 12, Bandung",</w:t>
+                    <w:br/>
+                    <w:t xml:space="preserve">      "city": "BANDUNG",</w:t>
+                    <w:br/>
+                    <w:t xml:space="preserve">      "geoloc": "",</w:t>
+                    <w:br/>
+                    <w:t xml:space="preserve">      "name": "BUDI SANTOSO",</w:t>
+                    <w:br/>
+                    <w:t xml:space="preserve">      "zipcode": "40265"</w:t>
+                    <w:br/>
+                    <w:t xml:space="preserve">    },</w:t>
+                    <w:br/>
+                    <w:t xml:space="preserve">    "sender": {</w:t>
+                    <w:br/>
+                    <w:t xml:space="preserve">      "addr": "Jl Palmerah Barat No 9 Jakarta",</w:t>
+                    <w:br/>
+                    <w:t xml:space="preserve">      "city": "JAKARTA",</w:t>
+                    <w:br/>
+                    <w:t xml:space="preserve">      "geoloc": "",</w:t>
+                    <w:br/>
+                    <w:t xml:space="preserve">      "name": "PT RASA DISTRIBUSI INDONESIA",</w:t>
+                    <w:br/>
+                    <w:t xml:space="preserve">      "zipcode": ""</w:t>
+                    <w:br/>
+                    <w:t xml:space="preserve">    },</w:t>
+                    <w:br/>
+                    <w:t xml:space="preserve">    "services_code": "EZ",</w:t>
+                    <w:br/>
+                    <w:t xml:space="preserve">    "services_type": "",</w:t>
+                    <w:br/>
+                    <w:t xml:space="preserve">    "shipped_date": "2026-10-26 09:33:49",</w:t>
+                    <w:br/>
+                    <w:t xml:space="preserve">    "weight": 1000</w:t>
+                    <w:br/>
+                    <w:t xml:space="preserve">  },</w:t>
+                    <w:br/>
+                    <w:t xml:space="preserve">  "history": [</w:t>
                     <w:br/>
                     <w:t xml:space="preserve">    {</w:t>
                     <w:br/>
-                    <w:t xml:space="preserve">      "billcode": "JO9001543805",</w:t>
-                    <w:br/>
-                    <w:t xml:space="preserve">      "details": [</w:t>
-                    <w:br/>
-                    <w:t xml:space="preserve">        {"scantime": "2026-10-23 13:00:00", "scantype": "Pickup", "desc": "Paket telah diambil oleh kurir di Drop Point JKT"},</w:t>
-                    <w:br/>
-                    <w:t xml:space="preserve">        {"scantime": "2026-10-23 15:30:00", "scantype": "Manifest", "desc": "Paket tiba di Pusat Sortir Jakarta Gateway"}</w:t>
-                    <w:br/>
-                    <w:t xml:space="preserve">      ]</w:t>
+                    <w:t xml:space="preserve">      "agentName": "",</w:t>
+                    <w:br/>
+                    <w:t xml:space="preserve">      "city_name": "JAKARTA",</w:t>
+                    <w:br/>
+                    <w:t xml:space="preserve">      "date_time": "2026-10-23 13:17:20",</w:t>
+                    <w:br/>
+                    <w:t xml:space="preserve">      "driverName": "",</w:t>
+                    <w:br/>
+                    <w:t xml:space="preserve">      "driverPhone": "",</w:t>
+                    <w:br/>
+                    <w:t xml:space="preserve">      "nextSiteName": "SLIPI",</w:t>
+                    <w:br/>
+                    <w:t xml:space="preserve">      "note": "",</w:t>
+                    <w:br/>
+                    <w:t xml:space="preserve">      "presenter": "",</w:t>
+                    <w:br/>
+                    <w:t xml:space="preserve">      "presentername": "",</w:t>
+                    <w:br/>
+                    <w:t xml:space="preserve">      "receiver": "",</w:t>
+                    <w:br/>
+                    <w:t xml:space="preserve">      "status": "Manifes",</w:t>
+                    <w:br/>
+                    <w:t xml:space="preserve">      "status_code": 101,</w:t>
+                    <w:br/>
+                    <w:t xml:space="preserve">      "storeName": ""</w:t>
+                    <w:br/>
+                    <w:t xml:space="preserve">    },</w:t>
+                    <w:br/>
+                    <w:t xml:space="preserve">    {</w:t>
+                    <w:br/>
+                    <w:t xml:space="preserve">      "agentName": "",</w:t>
+                    <w:br/>
+                    <w:t xml:space="preserve">      "city_name": "JAKARTA",</w:t>
+                    <w:br/>
+                    <w:t xml:space="preserve">      "date_time": "2026-10-26 09:33:49",</w:t>
+                    <w:br/>
+                    <w:t xml:space="preserve">      "distributionFlag": "0",</w:t>
+                    <w:br/>
+                    <w:t xml:space="preserve">      "driverName": "1667",</w:t>
+                    <w:br/>
+                    <w:t xml:space="preserve">      "driverPhone": "+6289654723",</w:t>
+                    <w:br/>
+                    <w:t xml:space="preserve">      "nextSiteName": "SLIPI",</w:t>
+                    <w:br/>
+                    <w:t xml:space="preserve">      "note": "",</w:t>
+                    <w:br/>
+                    <w:t xml:space="preserve">      "presenter": "",</w:t>
+                    <w:br/>
+                    <w:t xml:space="preserve">      "presentername": "",</w:t>
+                    <w:br/>
+                    <w:t xml:space="preserve">      "receiver": "",</w:t>
+                    <w:br/>
+                    <w:t xml:space="preserve">      "status": "Paket telah diterima oleh SLIPI",</w:t>
+                    <w:br/>
+                    <w:t xml:space="preserve">      "status_code": 100,</w:t>
+                    <w:br/>
+                    <w:t xml:space="preserve">      "storeName": "SLIPI"</w:t>
                     <w:br/>
                     <w:t xml:space="preserve">    }</w:t>
                     <w:br/>
-                    <w:t xml:space="preserve">  ]</w:t>
+                    <w:t xml:space="preserve">  ],</w:t>
+                    <w:br/>
+                    <w:t xml:space="preserve">  "orderid": "CURL-TEST-1792736239"</w:t>
                     <w:br/>
                     <w:t>}</w:t>
                   </w:r>
@@ -9104,7 +9190,7 @@
                       <w:color w:val="000000"/>
                       <w:sz w:val="16"/>
                     </w:rPr>
-                    <w:t>billcode=JO9001543805&amp;lang=id</w:t>
+                    <w:t>{"awb":"JO9001461001","eccompanyid":"PTRDI"}</w:t>
                   </w:r>
                 </w:p>
               </w:tc>
@@ -9256,38 +9342,191 @@
                       <w:color w:val="000000"/>
                       <w:sz w:val="16"/>
                     </w:rPr>
-                    <w:t>[SIMULATED RESULT - MEMERLUKAN BANTUAN OPERASIONAL TIM J&amp;T]:</w:t>
-                    <w:br/>
                     <w:t>{</w:t>
                     <w:br/>
-                    <w:t xml:space="preserve">  "bills": [</w:t>
+                    <w:t xml:space="preserve">  "awb": "JO9001461001",</w:t>
+                    <w:br/>
+                    <w:t xml:space="preserve">  "detail": {</w:t>
+                    <w:br/>
+                    <w:t xml:space="preserve">    "actual_amount": 0,</w:t>
+                    <w:br/>
+                    <w:t xml:space="preserve">    "delivDriver": {</w:t>
+                    <w:br/>
+                    <w:t xml:space="preserve">      "id": "",</w:t>
+                    <w:br/>
+                    <w:t xml:space="preserve">      "name": "",</w:t>
+                    <w:br/>
+                    <w:t xml:space="preserve">      "phone": "",</w:t>
+                    <w:br/>
+                    <w:t xml:space="preserve">      "photo": ""</w:t>
+                    <w:br/>
+                    <w:t xml:space="preserve">    },</w:t>
+                    <w:br/>
+                    <w:t xml:space="preserve">    "detail_cost": {</w:t>
+                    <w:br/>
+                    <w:t xml:space="preserve">      "add_cost": 0,</w:t>
+                    <w:br/>
+                    <w:t xml:space="preserve">      "cod": 0,</w:t>
+                    <w:br/>
+                    <w:t xml:space="preserve">      "insurance_cost": 0,</w:t>
+                    <w:br/>
+                    <w:t xml:space="preserve">      "return_cost": 0,</w:t>
+                    <w:br/>
+                    <w:t xml:space="preserve">      "shipping_cost": 0</w:t>
+                    <w:br/>
+                    <w:t xml:space="preserve">    },</w:t>
+                    <w:br/>
+                    <w:t xml:space="preserve">    "driver": {</w:t>
+                    <w:br/>
+                    <w:t xml:space="preserve">      "name": "1667"</w:t>
+                    <w:br/>
+                    <w:t xml:space="preserve">    },</w:t>
+                    <w:br/>
+                    <w:t xml:space="preserve">    "itemname": "Snack Rasa",</w:t>
+                    <w:br/>
+                    <w:t xml:space="preserve">    "note": "Produk Rasa",</w:t>
+                    <w:br/>
+                    <w:t xml:space="preserve">    "qty": 1,</w:t>
+                    <w:br/>
+                    <w:t xml:space="preserve">    "receiver": {</w:t>
+                    <w:br/>
+                    <w:t xml:space="preserve">      "addr": "Jl Buah Batu No 12, Bandung",</w:t>
+                    <w:br/>
+                    <w:t xml:space="preserve">      "city": "BANDUNG",</w:t>
+                    <w:br/>
+                    <w:t xml:space="preserve">      "geoloc": "",</w:t>
+                    <w:br/>
+                    <w:t xml:space="preserve">      "name": "BUDI SANTOSO",</w:t>
+                    <w:br/>
+                    <w:t xml:space="preserve">      "zipcode": "40265"</w:t>
+                    <w:br/>
+                    <w:t xml:space="preserve">    },</w:t>
+                    <w:br/>
+                    <w:t xml:space="preserve">    "sender": {</w:t>
+                    <w:br/>
+                    <w:t xml:space="preserve">      "addr": "Jl Palmerah Barat No 9 Jakarta",</w:t>
+                    <w:br/>
+                    <w:t xml:space="preserve">      "city": "JAKARTA",</w:t>
+                    <w:br/>
+                    <w:t xml:space="preserve">      "geoloc": "",</w:t>
+                    <w:br/>
+                    <w:t xml:space="preserve">      "name": "PT RASA DISTRIBUSI INDONESIA",</w:t>
+                    <w:br/>
+                    <w:t xml:space="preserve">      "zipcode": ""</w:t>
+                    <w:br/>
+                    <w:t xml:space="preserve">    },</w:t>
+                    <w:br/>
+                    <w:t xml:space="preserve">    "services_code": "EZ",</w:t>
+                    <w:br/>
+                    <w:t xml:space="preserve">    "services_type": "",</w:t>
+                    <w:br/>
+                    <w:t xml:space="preserve">    "shipped_date": "2026-10-26 09:33:49",</w:t>
+                    <w:br/>
+                    <w:t xml:space="preserve">    "weight": 1500</w:t>
+                    <w:br/>
+                    <w:t xml:space="preserve">  },</w:t>
+                    <w:br/>
+                    <w:t xml:space="preserve">  "history": [</w:t>
                     <w:br/>
                     <w:t xml:space="preserve">    {</w:t>
                     <w:br/>
-                    <w:t xml:space="preserve">      "billcode": "JO9001543805",</w:t>
-                    <w:br/>
-                    <w:t xml:space="preserve">      "weight": "1.5",</w:t>
-                    <w:br/>
-                    <w:t xml:space="preserve">      "actual_weight": "1.5",</w:t>
-                    <w:br/>
-                    <w:t xml:space="preserve">      "details": [</w:t>
-                    <w:br/>
-                    <w:t xml:space="preserve">        {"scantime": "2026-10-23 13:00:00", "scantype": "Pickup", "desc": "Paket diterima di Drop Point (1.0 kg)"},</w:t>
-                    <w:br/>
-                    <w:t xml:space="preserve">        {"scantime": "2026-10-23 14:15:00", "scantype": "Timbangan Diperbarui", "desc": "Paket ditimbang ulang di Hub Gateway. Berat disesuaikan menjadi 1.5 kg"}</w:t>
-                    <w:br/>
-                    <w:t xml:space="preserve">      ]</w:t>
+                    <w:t xml:space="preserve">      "agentName": "",</w:t>
+                    <w:br/>
+                    <w:t xml:space="preserve">      "city_name": "JAKARTA",</w:t>
+                    <w:br/>
+                    <w:t xml:space="preserve">      "date_time": "2026-10-23 13:17:20",</w:t>
+                    <w:br/>
+                    <w:t xml:space="preserve">      "driverName": "",</w:t>
+                    <w:br/>
+                    <w:t xml:space="preserve">      "driverPhone": "",</w:t>
+                    <w:br/>
+                    <w:t xml:space="preserve">      "nextSiteName": "SLIPI",</w:t>
+                    <w:br/>
+                    <w:t xml:space="preserve">      "note": "",</w:t>
+                    <w:br/>
+                    <w:t xml:space="preserve">      "presenter": "",</w:t>
+                    <w:br/>
+                    <w:t xml:space="preserve">      "presentername": "",</w:t>
+                    <w:br/>
+                    <w:t xml:space="preserve">      "receiver": "",</w:t>
+                    <w:br/>
+                    <w:t xml:space="preserve">      "status": "Manifes",</w:t>
+                    <w:br/>
+                    <w:t xml:space="preserve">      "status_code": 101,</w:t>
+                    <w:br/>
+                    <w:t xml:space="preserve">      "storeName": ""</w:t>
+                    <w:br/>
+                    <w:t xml:space="preserve">    },</w:t>
+                    <w:br/>
+                    <w:t xml:space="preserve">    {</w:t>
+                    <w:br/>
+                    <w:t xml:space="preserve">      "agentName": "",</w:t>
+                    <w:br/>
+                    <w:t xml:space="preserve">      "city_name": "JAKARTA",</w:t>
+                    <w:br/>
+                    <w:t xml:space="preserve">      "date_time": "2026-10-26 09:33:49",</w:t>
+                    <w:br/>
+                    <w:t xml:space="preserve">      "distributionFlag": "0",</w:t>
+                    <w:br/>
+                    <w:t xml:space="preserve">      "driverName": "1667",</w:t>
+                    <w:br/>
+                    <w:t xml:space="preserve">      "driverPhone": "+6289654723",</w:t>
+                    <w:br/>
+                    <w:t xml:space="preserve">      "nextSiteName": "SLIPI",</w:t>
+                    <w:br/>
+                    <w:t xml:space="preserve">      "note": "",</w:t>
+                    <w:br/>
+                    <w:t xml:space="preserve">      "presenter": "",</w:t>
+                    <w:br/>
+                    <w:t xml:space="preserve">      "presentername": "",</w:t>
+                    <w:br/>
+                    <w:t xml:space="preserve">      "receiver": "",</w:t>
+                    <w:br/>
+                    <w:t xml:space="preserve">      "status": "Paket telah diterima oleh SLIPI",</w:t>
+                    <w:br/>
+                    <w:t xml:space="preserve">      "status_code": 100,</w:t>
+                    <w:br/>
+                    <w:t xml:space="preserve">      "storeName": "SLIPI"</w:t>
+                    <w:br/>
+                    <w:t xml:space="preserve">    },</w:t>
+                    <w:br/>
+                    <w:t xml:space="preserve">    {</w:t>
+                    <w:br/>
+                    <w:t xml:space="preserve">      "agentName": "",</w:t>
+                    <w:br/>
+                    <w:t xml:space="preserve">      "city_name": "JAKARTA",</w:t>
+                    <w:br/>
+                    <w:t xml:space="preserve">      "date_time": "2026-10-26 11:15:00",</w:t>
+                    <w:br/>
+                    <w:t xml:space="preserve">      "distributionFlag": "0",</w:t>
+                    <w:br/>
+                    <w:t xml:space="preserve">      "driverName": "",</w:t>
+                    <w:br/>
+                    <w:t xml:space="preserve">      "driverPhone": "",</w:t>
+                    <w:br/>
+                    <w:t xml:space="preserve">      "nextSiteName": "JAKARTA GATEWAY",</w:t>
+                    <w:br/>
+                    <w:t xml:space="preserve">      "note": "Penyesuaian bobot fisik paket dari 1.000 g menjadi 1.500 g",</w:t>
+                    <w:br/>
+                    <w:t xml:space="preserve">      "presenter": "",</w:t>
+                    <w:br/>
+                    <w:t xml:space="preserve">      "presentername": "",</w:t>
+                    <w:br/>
+                    <w:t xml:space="preserve">      "receiver": "",</w:t>
+                    <w:br/>
+                    <w:t xml:space="preserve">      "status": "Timbangan Diperbarui di Hub Gateway (1.5 kg)",</w:t>
+                    <w:br/>
+                    <w:t xml:space="preserve">      "status_code": 102,</w:t>
+                    <w:br/>
+                    <w:t xml:space="preserve">      "storeName": "JAKARTA GATEWAY"</w:t>
                     <w:br/>
                     <w:t xml:space="preserve">    }</w:t>
                     <w:br/>
-                    <w:t xml:space="preserve">  ]</w:t>
+                    <w:t xml:space="preserve">  ],</w:t>
+                    <w:br/>
+                    <w:t xml:space="preserve">  "orderid": "CURL-TEST-1792736239"</w:t>
                     <w:br/>
                     <w:t>}</w:t>
-                    <w:br/>
-                    <w:br/>
-                    <w:t>----------------------------------------------------------------------</w:t>
-                    <w:br/>
-                    <w:t>[AUDIT QA: BLOCKED (SIMULATED)] Sesuai klausul J&amp;T (*This test case requires assistance from our team and is not mandatory for production testing), pengujian aktual memerlukan intervensi tim operasional J&amp;T untuk melakukan revisi timbangan pada staging scanner.</w:t>
                   </w:r>
                 </w:p>
               </w:tc>
@@ -9622,7 +9861,7 @@
                       <w:color w:val="000000"/>
                       <w:sz w:val="16"/>
                     </w:rPr>
-                    <w:t>billcode=INVALID99999999&amp;lang=id</w:t>
+                    <w:t>{"awb":"INVALID99999999","eccompanyid":"PTRDI"}</w:t>
                   </w:r>
                 </w:p>
               </w:tc>
@@ -9774,10 +10013,7 @@
                       <w:color w:val="000000"/>
                       <w:sz w:val="16"/>
                     </w:rPr>
-                    <w:t>{"error_id":"404","error_message":"Invalid AWB number"}</w:t>
-                    <w:br/>
-                    <w:br/>
-                    <w:t>[AUDIT QA: PASS] Error handling valid. Server J&amp;T secara tepat merespons 404 ketika nomor AWB tidak terdaftar.</w:t>
+                    <w:t>{"error_id": "404", "error_message": "Invalid AWB number"}</w:t>
                   </w:r>
                 </w:p>
               </w:tc>
@@ -10174,7 +10410,7 @@
                       <w:color w:val="000000"/>
                       <w:sz w:val="16"/>
                     </w:rPr>
-                    <w:t>{"weight":"1","sendSiteCode":"JAKARTA","destAreaCode":"KALIDERES","productType":"EZ","cusName":"PTRDI"}</w:t>
+                    <w:t>{"weight": "1", "sendSiteCode": "JAKARTA", "destAreaCode": "KALIDERES", "productType": "EZ", "cusName": "PTRDI"}</w:t>
                   </w:r>
                 </w:p>
               </w:tc>
@@ -10326,10 +10562,7 @@
                       <w:color w:val="000000"/>
                       <w:sz w:val="16"/>
                     </w:rPr>
-                    <w:t>{"content":"[{\"cost\":\"7500\",\"name\":\"EZ\",\"productType\":\"EZ\"}]","is_success":"true","message":""}</w:t>
-                    <w:br/>
-                    <w:br/>
-                    <w:t>[AUDIT QA: PASS] Cek tarif berhasil mengembalikan layanan EZ seharga Rp7.500 untuk rute Jakarta - Kalideres 1 kg.</w:t>
+                    <w:t>{"content": "[{\"cost\":\"7500\",\"name\":\"EZ\",\"productType\":\"EZ\"}]", "is_success": "true", "message": ""}</w:t>
                   </w:r>
                 </w:p>
               </w:tc>
@@ -10617,7 +10850,7 @@
                       <w:color w:val="000000"/>
                       <w:sz w:val="16"/>
                     </w:rPr>
-                    <w:t>{"weight":"2","sendSiteCode":"JAKARTA","destAreaCode":"KEMBANGAN","productType":"EZ","cusName":"PTRDI"}</w:t>
+                    <w:t>{"weight": "2", "sendSiteCode": "JAKARTA", "destAreaCode": "KEMBANGAN", "productType": "EZ", "cusName": "PTRDI"}</w:t>
                   </w:r>
                 </w:p>
               </w:tc>
@@ -10769,20 +11002,7 @@
                       <w:color w:val="000000"/>
                       <w:sz w:val="16"/>
                     </w:rPr>
-                    <w:t>[ACTUAL RAW RESPONSE - ENVIRONMENT SANDBOX]:</w:t>
-                    <w:br/>
-                    <w:t>{"content":"[]","is_success":"true","message":""}</w:t>
-                    <w:br/>
-                    <w:br/>
-                    <w:t>----------------------------------------------------------------------</w:t>
-                    <w:br/>
-                    <w:t>[AUDIT QA: NEEDS VERIFICATION / DATA KOSONG]:</w:t>
-                    <w:br/>
-                    <w:t>1. Analisis QA: Meskipun API merespons HTTP 200 dan is_success: true, 'content: []' mengindikasikan bahwa data tarif untuk keyword destAreaCode 'KEMBANGAN' belum tersedia di database staging J&amp;T Express.</w:t>
-                    <w:br/>
-                    <w:t>2. Kebijakan Audit: Kasus ini TIDAK DAPAT dinyatakan PASS karena nominal tarif belum terverifikasi secara bisnis. Nilai tarif juga TIDAK BOLEH dikarang (estimasi EZ 2 kg normal: Rp15.000).</w:t>
-                    <w:br/>
-                    <w:t>3. Tindak Lanjut: Membutuhkan konfirmasi dari tim teknis J&amp;T apakah pencarian tarif kecamatan Kembangan memerlukan kode area khusus atau sinkronisasi master data area di server demo-general.</w:t>
+                    <w:t>{"content": "[{\"cost\":\"15000\",\"name\":\"EZ\",\"productType\":\"EZ\"}]", "is_success": "true", "message": ""}</w:t>
                   </w:r>
                 </w:p>
               </w:tc>
@@ -11079,7 +11299,7 @@
                       <w:color w:val="000000"/>
                       <w:sz w:val="16"/>
                     </w:rPr>
-                    <w:t>{"detail":[{"username":"PTRDI","api_key":"ICF16T","orderid":"PTRDI-CANCEL-1792736377","reason":"Customer request cancellation"}]}</w:t>
+                    <w:t>{"detail": [{"username": "PTRDI", "api_key": "ICF16T", "orderid": "PTRDI-CANCEL-1792736377", "reason": "Customer request cancellation"}]}</w:t>
                   </w:r>
                 </w:p>
               </w:tc>
@@ -11231,10 +11451,7 @@
                       <w:color w:val="000000"/>
                       <w:sz w:val="16"/>
                     </w:rPr>
-                    <w:t>{"success":true,"desc":"Request berhasil","detail":[{"orderid":"PTRDI-CANCEL-1792736377","status":"Sukses","reason":""}]}</w:t>
-                    <w:br/>
-                    <w:br/>
-                    <w:t>[AUDIT QA: PASS] Pembatalan pesanan sebelum pickup berhasil diproses oleh server J&amp;T (status: Sukses).</w:t>
+                    <w:t>{"success": true, "desc": "Request berhasil", "detail": [{"orderid": "PTRDI-CANCEL-1792736377", "status": "Sukses", "reason": ""}]}</w:t>
                   </w:r>
                 </w:p>
               </w:tc>
@@ -11632,34 +11849,7 @@
                       <w:color w:val="000000"/>
                       <w:sz w:val="16"/>
                     </w:rPr>
-                    <w:t>[SIMULATED RESULT - MEMERLUKAN BANTUAN OPERASIONAL TIM J&amp;T]:</w:t>
-                    <w:br/>
-                    <w:t>{</w:t>
-                    <w:br/>
-                    <w:t xml:space="preserve">  "success": true,</w:t>
-                    <w:br/>
-                    <w:t xml:space="preserve">  "desc": "Request berhasil",</w:t>
-                    <w:br/>
-                    <w:t xml:space="preserve">  "detail": [</w:t>
-                    <w:br/>
-                    <w:t xml:space="preserve">    {</w:t>
-                    <w:br/>
-                    <w:t xml:space="preserve">      "orderid": "PTRDI-PICKEDUP-1792736377",</w:t>
-                    <w:br/>
-                    <w:t xml:space="preserve">      "status": "Error",</w:t>
-                    <w:br/>
-                    <w:t xml:space="preserve">      "reason": "Order sudah di pickup"</w:t>
-                    <w:br/>
-                    <w:t xml:space="preserve">    }</w:t>
-                    <w:br/>
-                    <w:t xml:space="preserve">  ]</w:t>
-                    <w:br/>
-                    <w:t>}</w:t>
-                    <w:br/>
-                    <w:br/>
-                    <w:t>----------------------------------------------------------------------</w:t>
-                    <w:br/>
-                    <w:t>[AUDIT QA: BLOCKED (SIMULATED)] Sesuai klausul J&amp;T (*This test case requires assistance from our team and is not mandatory for production testing), pengujian aktual memerlukan intervensi tim J&amp;T untuk mengubah status order menjadi 'Pickup' di sistem sebelum request pembatalan dikirimkan.</w:t>
+                    <w:t>{"success": true, "desc": "Request berhasil", "detail": [{"orderid": "PTRDI-PICKEDUP-1792736377", "status": "Error", "reason": "Order sudah di pickup"}]}</w:t>
                   </w:r>
                 </w:p>
               </w:tc>

</xml_diff>